<commit_message>
Style reference: bold shaded header row for tables
</commit_message>
<xml_diff>
--- a/docs/reference.docx
+++ b/docs/reference.docx
@@ -9,7 +9,7 @@
     </w:p>
     <w:tbl>
       <w:tblPr>
-        <w:tblStyle w:val="LightShading"/>
+        <w:tblStyle w:val="TableGrid"/>
         <w:tblW w:type="auto" w:w="0"/>
         <w:tblLook w:firstColumn="1" w:firstRow="1" w:lastColumn="0" w:lastRow="0" w:noHBand="0" w:noVBand="1" w:val="04A0"/>
       </w:tblPr>
@@ -21,9 +21,13 @@
         <w:tc>
           <w:tcPr>
             <w:tcW w:type="dxa" w:w="4320"/>
+            <w:shd w:val="clear" w:color="auto" w:fill="D9D9D9"/>
           </w:tcPr>
           <w:p>
             <w:r>
+              <w:rPr>
+                <w:b/>
+              </w:rPr>
               <w:t>Sample 0,0</w:t>
             </w:r>
           </w:p>
@@ -31,9 +35,13 @@
         <w:tc>
           <w:tcPr>
             <w:tcW w:type="dxa" w:w="4320"/>
+            <w:shd w:val="clear" w:color="auto" w:fill="D9D9D9"/>
           </w:tcPr>
           <w:p>
             <w:r>
+              <w:rPr>
+                <w:b/>
+              </w:rPr>
               <w:t>Sample 0,1</w:t>
             </w:r>
           </w:p>

</xml_diff>